<commit_message>
UPDATED ERD AND SQL
</commit_message>
<xml_diff>
--- a/Documents/ST10480375_POE_PART_1_ERD.docx
+++ b/Documents/ST10480375_POE_PART_1_ERD.docx
@@ -80,10 +80,10 @@
         </w:rPr>
         <w:lastRenderedPageBreak/>
         <w:drawing>
-          <wp:inline distT="0" distB="0" distL="0" distR="0" wp14:anchorId="2CE9C253" wp14:editId="68B74144">
-            <wp:extent cx="5731510" cy="4097655"/>
-            <wp:effectExtent l="0" t="0" r="2540" b="0"/>
-            <wp:docPr id="1535652974" name="Picture 1"/>
+          <wp:inline distT="0" distB="0" distL="0" distR="0" wp14:anchorId="758E3B49" wp14:editId="45FB5A16">
+            <wp:extent cx="5731510" cy="4015740"/>
+            <wp:effectExtent l="0" t="0" r="2540" b="3810"/>
+            <wp:docPr id="2017503354" name="Picture 1"/>
             <wp:cNvGraphicFramePr>
               <a:graphicFrameLocks xmlns:a="http://schemas.openxmlformats.org/drawingml/2006/main" noChangeAspect="1"/>
             </wp:cNvGraphicFramePr>
@@ -91,7 +91,7 @@
               <a:graphicData uri="http://schemas.openxmlformats.org/drawingml/2006/picture">
                 <pic:pic xmlns:pic="http://schemas.openxmlformats.org/drawingml/2006/picture">
                   <pic:nvPicPr>
-                    <pic:cNvPr id="1535652974" name=""/>
+                    <pic:cNvPr id="2017503354" name=""/>
                     <pic:cNvPicPr/>
                   </pic:nvPicPr>
                   <pic:blipFill>
@@ -103,7 +103,7 @@
                   <pic:spPr>
                     <a:xfrm>
                       <a:off x="0" y="0"/>
-                      <a:ext cx="5731510" cy="4097655"/>
+                      <a:ext cx="5731510" cy="4015740"/>
                     </a:xfrm>
                     <a:prstGeom prst="rect">
                       <a:avLst/>

</xml_diff>